<commit_message>
fix: report values and naming
</commit_message>
<xml_diff>
--- a/src/templates/report.docx
+++ b/src/templates/report.docx
@@ -891,7 +891,6 @@
         <w:rPr>
           <w:lang w:val="en-US"/>
         </w:rPr>
-        <w:lastRenderedPageBreak/>
         <w:t>{/</w:t>
       </w:r>
       <w:proofErr w:type="spellStart"/>
@@ -918,6 +917,7 @@
         </w:numPr>
       </w:pPr>
       <w:r>
+        <w:lastRenderedPageBreak/>
         <w:t>Kaltluftentstehung</w:t>
       </w:r>
       <w:r>
@@ -1479,7 +1479,6 @@
         </w:numPr>
       </w:pPr>
       <w:r>
-        <w:lastRenderedPageBreak/>
         <w:t>{.}</w:t>
       </w:r>
     </w:p>
@@ -1528,6 +1527,7 @@
         <w:rPr>
           <w:lang w:val="en-US"/>
         </w:rPr>
+        <w:lastRenderedPageBreak/>
         <w:t>Kleingewässer</w:t>
       </w:r>
       <w:proofErr w:type="spellEnd"/>
@@ -2323,7 +2323,10 @@
               <w:pStyle w:val="BodytextBGI"/>
             </w:pPr>
             <w:r>
-              <w:t>Extensive Dachbegrünung</w:t>
+              <w:t>Intensive</w:t>
+            </w:r>
+            <w:r>
+              <w:t xml:space="preserve"> Dachbegrünung</w:t>
             </w:r>
           </w:p>
         </w:tc>
@@ -2420,7 +2423,10 @@
               <w:pStyle w:val="BodytextBGI"/>
             </w:pPr>
             <w:r>
-              <w:t>Erdgebundene Fassadenbegrünung</w:t>
+              <w:t>Bodengebundene</w:t>
+            </w:r>
+            <w:r>
+              <w:t xml:space="preserve"> Fassadenbegrünung</w:t>
             </w:r>
           </w:p>
         </w:tc>
@@ -4059,9 +4065,9 @@
         <w:tblLook w:val="04A0" w:firstRow="1" w:lastRow="0" w:firstColumn="1" w:lastColumn="0" w:noHBand="0" w:noVBand="1"/>
       </w:tblPr>
       <w:tblGrid>
-        <w:gridCol w:w="3680"/>
-        <w:gridCol w:w="3444"/>
-        <w:gridCol w:w="3361"/>
+        <w:gridCol w:w="3870"/>
+        <w:gridCol w:w="3270"/>
+        <w:gridCol w:w="3345"/>
       </w:tblGrid>
       <w:tr>
         <w:tc>

</xml_diff>